<commit_message>
docs: map features to milestones and name the OOP principles the rubric asks for
Rubric tightening: every scope-table row now names its milestone (M1
contracts ... M6 future), and the code-quality section explicitly covers
inheritance and reusable components alongside the principles already
discussed. The video script gains a live cross-browser spot-check so the
compatibility claim has on-camera evidence. Still 5 pages.
</commit_message>
<xml_diff>
--- a/docs/technical-report.docx
+++ b/docs/technical-report.docx
@@ -220,6 +220,12 @@
               </w:rPr>
               <w:t xml:space="preserve">Completed</w:t>
             </w:r>
+            <w:r>
+              <w:t xml:space="preserve"> </w:t>
+            </w:r>
+            <w:r>
+              <w:t xml:space="preserve">· M1 · Contracts</w:t>
+            </w:r>
           </w:p>
         </w:tc>
         <w:tc>
@@ -276,6 +282,12 @@
               </w:rPr>
               <w:t xml:space="preserve">Completed</w:t>
             </w:r>
+            <w:r>
+              <w:t xml:space="preserve"> </w:t>
+            </w:r>
+            <w:r>
+              <w:t xml:space="preserve">· M2 · Oracle</w:t>
+            </w:r>
           </w:p>
         </w:tc>
         <w:tc>
@@ -341,6 +353,12 @@
               </w:rPr>
               <w:t xml:space="preserve">Completed</w:t>
             </w:r>
+            <w:r>
+              <w:t xml:space="preserve"> </w:t>
+            </w:r>
+            <w:r>
+              <w:t xml:space="preserve">· M2 · Oracle</w:t>
+            </w:r>
           </w:p>
         </w:tc>
         <w:tc>
@@ -409,6 +427,12 @@
               </w:rPr>
               <w:t xml:space="preserve">Completed</w:t>
             </w:r>
+            <w:r>
+              <w:t xml:space="preserve"> </w:t>
+            </w:r>
+            <w:r>
+              <w:t xml:space="preserve">· M3 · Portals</w:t>
+            </w:r>
           </w:p>
         </w:tc>
         <w:tc>
@@ -501,6 +525,12 @@
               </w:rPr>
               <w:t xml:space="preserve">Completed</w:t>
             </w:r>
+            <w:r>
+              <w:t xml:space="preserve"> </w:t>
+            </w:r>
+            <w:r>
+              <w:t xml:space="preserve">· M3 · Portals</w:t>
+            </w:r>
           </w:p>
         </w:tc>
         <w:tc>
@@ -557,6 +587,12 @@
               </w:rPr>
               <w:t xml:space="preserve">Completed</w:t>
             </w:r>
+            <w:r>
+              <w:t xml:space="preserve"> </w:t>
+            </w:r>
+            <w:r>
+              <w:t xml:space="preserve">· M3 · Portals</w:t>
+            </w:r>
           </w:p>
         </w:tc>
         <w:tc>
@@ -634,6 +670,12 @@
               </w:rPr>
               <w:t xml:space="preserve">Completed</w:t>
             </w:r>
+            <w:r>
+              <w:t xml:space="preserve"> </w:t>
+            </w:r>
+            <w:r>
+              <w:t xml:space="preserve">· M4 · Research</w:t>
+            </w:r>
           </w:p>
         </w:tc>
         <w:tc>
@@ -690,6 +732,12 @@
               </w:rPr>
               <w:t xml:space="preserve">Completed (SMS optional)</w:t>
             </w:r>
+            <w:r>
+              <w:t xml:space="preserve"> </w:t>
+            </w:r>
+            <w:r>
+              <w:t xml:space="preserve">· M4 · Research</w:t>
+            </w:r>
           </w:p>
         </w:tc>
         <w:tc>
@@ -749,6 +797,12 @@
               </w:rPr>
               <w:t xml:space="preserve">Completed</w:t>
             </w:r>
+            <w:r>
+              <w:t xml:space="preserve"> </w:t>
+            </w:r>
+            <w:r>
+              <w:t xml:space="preserve">· M5 · Validation</w:t>
+            </w:r>
           </w:p>
         </w:tc>
         <w:tc>
@@ -811,6 +865,12 @@
               </w:rPr>
               <w:t xml:space="preserve">Completed</w:t>
             </w:r>
+            <w:r>
+              <w:t xml:space="preserve"> </w:t>
+            </w:r>
+            <w:r>
+              <w:t xml:space="preserve">· M5 · Validation</w:t>
+            </w:r>
           </w:p>
         </w:tc>
         <w:tc>
@@ -870,6 +930,12 @@
               </w:rPr>
               <w:t xml:space="preserve">Not implemented — justified</w:t>
             </w:r>
+            <w:r>
+              <w:t xml:space="preserve"> </w:t>
+            </w:r>
+            <w:r>
+              <w:t xml:space="preserve">· M6 · Future</w:t>
+            </w:r>
           </w:p>
         </w:tc>
         <w:tc>
@@ -1252,18 +1318,42 @@
           <w:b/>
           <w:bCs/>
         </w:rPr>
-        <w:t xml:space="preserve">Modularity &amp; reuse.</w:t>
-      </w:r>
-      <w:r>
-        <w:t xml:space="preserve"> </w:t>
-      </w:r>
-      <w:r>
-        <w:t xml:space="preserve">Shared UI primitives (</w:t>
+        <w:t xml:space="preserve">Inheritance &amp; reusable components.</w:t>
+      </w:r>
+      <w:r>
+        <w:t xml:space="preserve"> </w:t>
       </w:r>
       <w:r>
         <w:rPr>
           <w:rStyle w:val="VerbatimChar"/>
         </w:rPr>
+        <w:t xml:space="preserve">ErrorBoundary</w:t>
+      </w:r>
+      <w:r>
+        <w:t xml:space="preserve"> </w:t>
+      </w:r>
+      <w:r>
+        <w:t xml:space="preserve">extends React.Component once and protects every route; typed</w:t>
+      </w:r>
+      <w:r>
+        <w:t xml:space="preserve"> </w:t>
+      </w:r>
+      <w:r>
+        <w:rPr>
+          <w:rStyle w:val="VerbatimChar"/>
+        </w:rPr>
+        <w:t xml:space="preserve">interface</w:t>
+      </w:r>
+      <w:r>
+        <w:t xml:space="preserve"> </w:t>
+      </w:r>
+      <w:r>
+        <w:t xml:space="preserve">contracts (User, Policy, StorePersistence) are implemented by interchangeable parts. Shared reusable components (</w:t>
+      </w:r>
+      <w:r>
+        <w:rPr>
+          <w:rStyle w:val="VerbatimChar"/>
+        </w:rPr>
         <w:t xml:space="preserve">PolicyBrowser</w:t>
       </w:r>
       <w:r>
@@ -1291,7 +1381,7 @@
         <w:t xml:space="preserve">Avatar</w:t>
       </w:r>
       <w:r>
-        <w:t xml:space="preserve">), pure utility modules (</w:t>
+        <w:t xml:space="preserve">) and pure utilities (</w:t>
       </w:r>
       <w:r>
         <w:rPr>
@@ -1312,7 +1402,7 @@
         <w:t xml:space="preserve">utils/currency.ts</w:t>
       </w:r>
       <w:r>
-        <w:t xml:space="preserve">) and typed context providers compose the frontend; the React Context tree (theme → i18n → preferences → auth → policy) composes cross-cutting behaviour without duplication.</w:t>
+        <w:t xml:space="preserve">) compose the frontend; the Context tree (theme → i18n → preferences → auth → policy) layers cross-cutting behaviour without duplication.</w:t>
       </w:r>
     </w:p>
     <w:p>

</xml_diff>

<commit_message>
docs: humanise the report and switch to British English
Removed the AI-writing tells from the technical report, README and demo
script: em and en dashes replaced with ordinary punctuation, AI vocabulary
cut, sentence-case headings, straight quotes, and American spellings
converted to British (organised, serialise, maths, licence). Proper nouns
keep their native spelling (Climate Hazards Center). The report still
fits exactly 5 pages.
</commit_message>
<xml_diff>
--- a/docs/technical-report.docx
+++ b/docs/technical-report.docx
@@ -4,35 +4,11 @@
   <w:body>
     <w:p>
       <w:pPr>
-        <w:pStyle w:val="Title"/>
-      </w:pPr>
-      <w:r>
-        <w:t xml:space="preserve">Technical Report — Sokoto Rainfall Cover</w:t>
-      </w:r>
-    </w:p>
-    <w:p>
-      <w:pPr>
-        <w:pStyle w:val="Subtitle"/>
-      </w:pPr>
-      <w:r>
-        <w:t xml:space="preserve">Capstone Project: Technical Implementation &amp; Development Progress</w:t>
-      </w:r>
-    </w:p>
-    <w:p>
-      <w:pPr>
-        <w:pStyle w:val="Author"/>
-      </w:pPr>
-      <w:r>
-        <w:t xml:space="preserve">Chinemerem Judith Ugbo · Supervisor: Dr Aaron Izang</w:t>
-      </w:r>
-    </w:p>
-    <w:p>
-      <w:pPr>
         <w:pStyle w:val="Heading1"/>
       </w:pPr>
       <w:bookmarkStart w:id="9" w:name="_aec4a389ac2728b4b198c7ce943c702b6daf081"/>
       <w:r>
-        <w:t xml:space="preserve">Technical Report: Sokoto Rainfall Cover</w:t>
+        <w:t xml:space="preserve">Technical report: Sokoto Rainfall Cover</w:t>
       </w:r>
       <w:bookmarkEnd w:id="9"/>
     </w:p>
@@ -40,6 +16,30 @@
       <w:pPr>
         <w:pStyle w:val="FirstParagraph"/>
       </w:pPr>
+      <w:r>
+        <w:rPr>
+          <w:b/>
+          <w:bCs/>
+        </w:rPr>
+        <w:t xml:space="preserve">Capstone Project: Technical Implementation and Development Progress</w:t>
+      </w:r>
+      <w:r>
+        <w:t xml:space="preserve"> </w:t>
+      </w:r>
+      <w:r>
+        <w:t xml:space="preserve">· Chinemerem Judith Ugbo · Supervisor: Dr Aaron Izang</w:t>
+      </w:r>
+    </w:p>
+    <w:p>
+      <w:pPr>
+        <w:pStyle w:val="BodyText"/>
+      </w:pPr>
+      <w:r>
+        <w:t xml:space="preserve">A weather-index insurance platform on Ethereum: automatic drought cover for smallholder farmers in Sokoto State, Nigeria.</w:t>
+      </w:r>
+      <w:r>
+        <w:t xml:space="preserve"> </w:t>
+      </w:r>
       <w:r>
         <w:rPr>
           <w:i/>
@@ -119,7 +119,7 @@
         <w:pStyle w:val="FirstParagraph"/>
       </w:pPr>
       <w:r>
-        <w:t xml:space="preserve">The approved scope proposed a blockchain-based weather-index insurance system in which (1) rainfall is measured by multiple independent sources, (2) policies are sold and settled by smart contract without a claims process, and (3) farmers, field agents and administrators manage cover through a web application. The delivered system matches that scope; one planned element (SMS delivery) is implemented but optional in configuration, and fiat settlement is deliberately deferred (it requires a licensed payment provider).</w:t>
+        <w:t xml:space="preserve">The approved scope proposed a blockchain-based weather-index insurance system in which rainfall is measured by multiple independent sources, policies are sold and settled by smart contract without a claims process, and farmers, field agents and administrators manage cover through a web application. The delivered system matches that scope. One planned element (SMS delivery) is implemented but optional in configuration, and fiat settlement is deferred because it requires a licensed payment provider.</w:t>
       </w:r>
     </w:p>
     <w:tbl>
@@ -224,7 +224,7 @@
               <w:t xml:space="preserve"> </w:t>
             </w:r>
             <w:r>
-              <w:t xml:space="preserve">· M1 · Contracts</w:t>
+              <w:t xml:space="preserve">· M1 Contracts</w:t>
             </w:r>
           </w:p>
         </w:tc>
@@ -241,7 +241,7 @@
               <w:t xml:space="preserve">WeatherIndexInsurance.sol</w:t>
             </w:r>
             <w:r>
-              <w:t xml:space="preserve">; 56 tests; Policy #0 bought &amp; paid on Sepolia</w:t>
+              <w:t xml:space="preserve">; 56 tests; Policy #0 bought and paid on Sepolia</w:t>
             </w:r>
           </w:p>
         </w:tc>
@@ -286,7 +286,7 @@
               <w:t xml:space="preserve"> </w:t>
             </w:r>
             <w:r>
-              <w:t xml:space="preserve">· M2 · Oracle</w:t>
+              <w:t xml:space="preserve">· M2 Oracle</w:t>
             </w:r>
           </w:p>
         </w:tc>
@@ -303,7 +303,7 @@
               <w:t xml:space="preserve">OracleAggregator.sol</w:t>
             </w:r>
             <w:r>
-              <w:t xml:space="preserve">; 3 live sources; sim. Fig.</w:t>
+              <w:t xml:space="preserve">; 3 live sources; simulator Fig.</w:t>
             </w:r>
             <w:r>
               <w:t xml:space="preserve"> </w:t>
@@ -325,7 +325,7 @@
               <w:pStyle w:val="Compact"/>
             </w:pPr>
             <w:r>
-              <w:t xml:space="preserve">Automated oracle relayer + settlement keeper</w:t>
+              <w:t xml:space="preserve">Automated oracle relayer and settlement keeper</w:t>
             </w:r>
           </w:p>
         </w:tc>
@@ -357,7 +357,7 @@
               <w:t xml:space="preserve"> </w:t>
             </w:r>
             <w:r>
-              <w:t xml:space="preserve">· M2 · Oracle</w:t>
+              <w:t xml:space="preserve">· M2 Oracle</w:t>
             </w:r>
           </w:p>
         </w:tc>
@@ -431,7 +431,7 @@
               <w:t xml:space="preserve"> </w:t>
             </w:r>
             <w:r>
-              <w:t xml:space="preserve">· M3 · Portals</w:t>
+              <w:t xml:space="preserve">· M3 Portals</w:t>
             </w:r>
           </w:p>
         </w:tc>
@@ -482,9 +482,6 @@
                 <w:rStyle w:val="VerbatimChar"/>
               </w:rPr>
               <w:t xml:space="preserve">04</w:t>
-            </w:r>
-            <w:r>
-              <w:t xml:space="preserve">; route tests</w:t>
             </w:r>
           </w:p>
         </w:tc>
@@ -529,7 +526,7 @@
               <w:t xml:space="preserve"> </w:t>
             </w:r>
             <w:r>
-              <w:t xml:space="preserve">· M3 · Portals</w:t>
+              <w:t xml:space="preserve">· M3 Portals</w:t>
             </w:r>
           </w:p>
         </w:tc>
@@ -559,7 +556,7 @@
               <w:pStyle w:val="Compact"/>
             </w:pPr>
             <w:r>
-              <w:t xml:space="preserve">Admin console (policies, farmers &amp; agents, analytics)</w:t>
+              <w:t xml:space="preserve">Admin console (policies, farmers and agents, analytics)</w:t>
             </w:r>
           </w:p>
         </w:tc>
@@ -591,7 +588,7 @@
               <w:t xml:space="preserve"> </w:t>
             </w:r>
             <w:r>
-              <w:t xml:space="preserve">· M3 · Portals</w:t>
+              <w:t xml:space="preserve">· M3 Portals</w:t>
             </w:r>
           </w:p>
         </w:tc>
@@ -653,7 +650,7 @@
               <w:pStyle w:val="Compact"/>
             </w:pPr>
             <w:r>
-              <w:t xml:space="preserve">Study/demonstrate consensus design</w:t>
+              <w:t xml:space="preserve">Study and demonstrate the consensus design</w:t>
             </w:r>
           </w:p>
         </w:tc>
@@ -674,7 +671,7 @@
               <w:t xml:space="preserve"> </w:t>
             </w:r>
             <w:r>
-              <w:t xml:space="preserve">· M4 · Research</w:t>
+              <w:t xml:space="preserve">· M4 Research</w:t>
             </w:r>
           </w:p>
         </w:tc>
@@ -691,7 +688,16 @@
               <w:t xml:space="preserve">/admin/backtest</w:t>
             </w:r>
             <w:r>
-              <w:t xml:space="preserve">; 121 historical dekads (backtest-results.md)</w:t>
+              <w:t xml:space="preserve">; 121 historical dekads (</w:t>
+            </w:r>
+            <w:r>
+              <w:rPr>
+                <w:rStyle w:val="VerbatimChar"/>
+              </w:rPr>
+              <w:t xml:space="preserve">backtest-results.md</w:t>
+            </w:r>
+            <w:r>
+              <w:t xml:space="preserve">)</w:t>
             </w:r>
           </w:p>
         </w:tc>
@@ -715,7 +721,7 @@
               <w:pStyle w:val="Compact"/>
             </w:pPr>
             <w:r>
-              <w:t xml:space="preserve">Tell farmers about purchases/payouts</w:t>
+              <w:t xml:space="preserve">Tell farmers about purchases and payouts</w:t>
             </w:r>
           </w:p>
         </w:tc>
@@ -736,18 +742,18 @@
               <w:t xml:space="preserve"> </w:t>
             </w:r>
             <w:r>
-              <w:t xml:space="preserve">· M4 · Research</w:t>
-            </w:r>
-          </w:p>
-        </w:tc>
-        <w:tc>
-          <w:tcPr/>
-          <w:p>
-            <w:pPr>
-              <w:pStyle w:val="Compact"/>
-            </w:pPr>
-            <w:r>
-              <w:t xml:space="preserve">real event notifications; email codes; SMS via</w:t>
+              <w:t xml:space="preserve">· M4 Research</w:t>
+            </w:r>
+          </w:p>
+        </w:tc>
+        <w:tc>
+          <w:tcPr/>
+          <w:p>
+            <w:pPr>
+              <w:pStyle w:val="Compact"/>
+            </w:pPr>
+            <w:r>
+              <w:t xml:space="preserve">real event notifications; email codes; SMS behind</w:t>
             </w:r>
             <w:r>
               <w:t xml:space="preserve"> </w:t>
@@ -769,7 +775,7 @@
               <w:pStyle w:val="Compact"/>
             </w:pPr>
             <w:r>
-              <w:t xml:space="preserve">Testing &amp; security audit</w:t>
+              <w:t xml:space="preserve">Testing and security audit</w:t>
             </w:r>
           </w:p>
         </w:tc>
@@ -801,7 +807,7 @@
               <w:t xml:space="preserve"> </w:t>
             </w:r>
             <w:r>
-              <w:t xml:space="preserve">· M5 · Validation</w:t>
+              <w:t xml:space="preserve">· M5 Validation</w:t>
             </w:r>
           </w:p>
         </w:tc>
@@ -837,7 +843,7 @@
               <w:pStyle w:val="Compact"/>
             </w:pPr>
             <w:r>
-              <w:t xml:space="preserve">Deployment (public site + testnet)</w:t>
+              <w:t xml:space="preserve">Deployment (public site and testnet)</w:t>
             </w:r>
           </w:p>
         </w:tc>
@@ -869,7 +875,7 @@
               <w:t xml:space="preserve"> </w:t>
             </w:r>
             <w:r>
-              <w:t xml:space="preserve">· M5 · Validation</w:t>
+              <w:t xml:space="preserve">· M5 Validation</w:t>
             </w:r>
           </w:p>
         </w:tc>
@@ -928,24 +934,24 @@
                 <w:b/>
                 <w:bCs/>
               </w:rPr>
-              <w:t xml:space="preserve">Not implemented — justified</w:t>
+              <w:t xml:space="preserve">Not implemented; justified</w:t>
             </w:r>
             <w:r>
               <w:t xml:space="preserve"> </w:t>
             </w:r>
             <w:r>
-              <w:t xml:space="preserve">· M6 · Future</w:t>
-            </w:r>
-          </w:p>
-        </w:tc>
-        <w:tc>
-          <w:tcPr/>
-          <w:p>
-            <w:pPr>
-              <w:pStyle w:val="Compact"/>
-            </w:pPr>
-            <w:r>
-              <w:t xml:space="preserve">Needs a licensed provider; receipts record the naira leg; future work</w:t>
+              <w:t xml:space="preserve">· M6 Future</w:t>
+            </w:r>
+          </w:p>
+        </w:tc>
+        <w:tc>
+          <w:tcPr/>
+          <w:p>
+            <w:pPr>
+              <w:pStyle w:val="Compact"/>
+            </w:pPr>
+            <w:r>
+              <w:t xml:space="preserve">needs a licensed provider; receipts record the naira leg; future work</w:t>
             </w:r>
           </w:p>
         </w:tc>
@@ -960,13 +966,13 @@
           <w:i/>
           <w:iCs/>
         </w:rPr>
-        <w:t xml:space="preserve">Scope changes:</w:t>
-      </w:r>
-      <w:r>
-        <w:t xml:space="preserve"> </w:t>
-      </w:r>
-      <w:r>
-        <w:t xml:space="preserve">none dropped for convenience. The naira leg was designed as receipted off-chain settlement (a licensed off-ramp is beyond a student project), and deployment widened from a local chain to live Sepolia — adding real wallet integration, RPC resilience and network-safety work.</w:t>
+        <w:t xml:space="preserve">Scope changes.</w:t>
+      </w:r>
+      <w:r>
+        <w:t xml:space="preserve"> </w:t>
+      </w:r>
+      <w:r>
+        <w:t xml:space="preserve">Nothing was dropped for convenience. The naira leg was designed as receipted off-chain settlement from the start, since a licensed off-ramp is beyond a student project. Deployment widened from a local chain to live Sepolia, which added wallet integration, RPC resilience and network-safety work.</w:t>
       </w:r>
     </w:p>
     <w:p>
@@ -984,7 +990,7 @@
         <w:pStyle w:val="FirstParagraph"/>
       </w:pPr>
       <w:r>
-        <w:t xml:space="preserve">The walkthrough video (linked in the README) demonstrates, in order:</w:t>
+        <w:t xml:space="preserve">The walkthrough video (linked in the README) covers these in order.</w:t>
       </w:r>
     </w:p>
     <w:p>
@@ -996,734 +1002,545 @@
           <w:b/>
           <w:bCs/>
         </w:rPr>
-        <w:t xml:space="preserve">A. Core functionalities</w:t>
-      </w:r>
-      <w:r>
-        <w:t xml:space="preserve"> </w:t>
-      </w:r>
-      <w:r>
-        <w:t xml:space="preserve">— policy purchase as agent and as farmer, the farmer dashboard and payouts ledger, the admin’s</w:t>
-      </w:r>
-      <w:r>
-        <w:t xml:space="preserve"> </w:t>
-      </w:r>
+        <w:t xml:space="preserve">A. Core functionalities.</w:t>
+      </w:r>
+      <w:r>
+        <w:t xml:space="preserve"> </w:t>
+      </w:r>
+      <w:r>
+        <w:t xml:space="preserve">Policy purchase as agent and as farmer; the farmer dashboard and payouts ledger; the admin’s oracle evaluation view; the consensus simulator corrupting one source; the backtest.</w:t>
+      </w:r>
+    </w:p>
+    <w:p>
+      <w:pPr>
+        <w:pStyle w:val="BodyText"/>
+      </w:pPr>
+      <w:r>
+        <w:rPr>
+          <w:b/>
+          <w:bCs/>
+        </w:rPr>
+        <w:t xml:space="preserve">B. Technical requirements.</w:t>
+      </w:r>
+      <w:r>
+        <w:t xml:space="preserve"> </w:t>
+      </w:r>
+      <w:r>
+        <w:t xml:space="preserve">Each screen is shown wired end to end: React/TypeScript to Express/TypeScript to Firebase to ethers.js to Solidity on Sepolia, fed by three live rainfall APIs.</w:t>
+      </w:r>
+    </w:p>
+    <w:p>
+      <w:pPr>
+        <w:pStyle w:val="BodyText"/>
+      </w:pPr>
+      <w:r>
+        <w:rPr>
+          <w:b/>
+          <w:bCs/>
+        </w:rPr>
+        <w:t xml:space="preserve">C. Testing with inputs.</w:t>
+      </w:r>
+      <w:r>
+        <w:t xml:space="preserve"> </w:t>
+      </w:r>
+      <w:r>
+        <w:t xml:space="preserve">Wrong premium, closed window, insufficient pool capacity, wrong wallet network, invalid codes and role escalation are each shown refusing safely with a plain-language error.</w:t>
+      </w:r>
+    </w:p>
+    <w:p>
+      <w:pPr>
+        <w:pStyle w:val="BodyText"/>
+      </w:pPr>
+      <w:r>
+        <w:rPr>
+          <w:b/>
+          <w:bCs/>
+        </w:rPr>
+        <w:t xml:space="preserve">D. Testing strategies.</w:t>
+      </w:r>
+      <w:r>
+        <w:t xml:space="preserve"> </w:t>
+      </w:r>
+      <w:r>
+        <w:t xml:space="preserve">Unit and functional testing plus integration testing (section 3.3).</w:t>
+      </w:r>
+      <w:r>
+        <w:t xml:space="preserve"> </w:t>
+      </w:r>
+      <w:r>
+        <w:rPr>
+          <w:b/>
+          <w:bCs/>
+        </w:rPr>
+        <w:t xml:space="preserve">E. Performance and compatibility.</w:t>
+      </w:r>
+      <w:r>
+        <w:t xml:space="preserve"> </w:t>
+      </w:r>
+      <w:r>
+        <w:t xml:space="preserve">Measured latency and bundle sizes (section 3.4), desktop and mobile layouts, and a live cross-browser check.</w:t>
+      </w:r>
+    </w:p>
+    <w:p>
+      <w:pPr>
+        <w:pStyle w:val="Heading2"/>
+      </w:pPr>
+      <w:bookmarkStart w:id="12" w:name="_e67d4b4221587c501332962336c46306f2b0389"/>
+      <w:r>
+        <w:t xml:space="preserve">3. Code Quality and Technical Implementation</w:t>
+      </w:r>
+      <w:bookmarkEnd w:id="12"/>
+    </w:p>
+    <w:p>
+      <w:pPr>
+        <w:pStyle w:val="Heading3"/>
+      </w:pPr>
+      <w:bookmarkStart w:id="13" w:name="_4c01f02e15ac4d4f3541a8f7e7b755a34c17d56"/>
+      <w:r>
+        <w:t xml:space="preserve">3.1 OOP principles and architecture</w:t>
+      </w:r>
+      <w:bookmarkEnd w:id="13"/>
+    </w:p>
+    <w:p>
+      <w:pPr>
+        <w:pStyle w:val="FirstParagraph"/>
+      </w:pPr>
+      <w:r>
+        <w:t xml:space="preserve">The codebase is organised by layer (</w:t>
+      </w:r>
+      <w:r>
+        <w:rPr>
+          <w:rStyle w:val="VerbatimChar"/>
+        </w:rPr>
+        <w:t xml:space="preserve">blockchain/</w:t>
+      </w:r>
+      <w:r>
+        <w:t xml:space="preserve">,</w:t>
+      </w:r>
+      <w:r>
+        <w:t xml:space="preserve"> </w:t>
+      </w:r>
+      <w:r>
+        <w:rPr>
+          <w:rStyle w:val="VerbatimChar"/>
+        </w:rPr>
+        <w:t xml:space="preserve">backend/</w:t>
+      </w:r>
+      <w:r>
+        <w:t xml:space="preserve">,</w:t>
+      </w:r>
+      <w:r>
+        <w:t xml:space="preserve"> </w:t>
+      </w:r>
+      <w:r>
+        <w:rPr>
+          <w:rStyle w:val="VerbatimChar"/>
+        </w:rPr>
+        <w:t xml:space="preserve">frontend/</w:t>
+      </w:r>
+      <w:r>
+        <w:t xml:space="preserve">) with clear separation of concerns and no monolithic scripts.</w:t>
+      </w:r>
+    </w:p>
+    <w:p>
+      <w:pPr>
+        <w:pStyle w:val="BodyText"/>
+      </w:pPr>
       <w:r>
         <w:rPr>
           <w:i/>
           <w:iCs/>
         </w:rPr>
-        <w:t xml:space="preserve">oracle evaluation</w:t>
-      </w:r>
-      <w:r>
-        <w:t xml:space="preserve"> </w:t>
-      </w:r>
-      <w:r>
-        <w:t xml:space="preserve">view, the consensus simulator corrupting one source, and the backtest.</w:t>
-      </w:r>
-      <w:r>
-        <w:t xml:space="preserve"> </w:t>
-      </w:r>
+        <w:t xml:space="preserve">Encapsulation and abstraction.</w:t>
+      </w:r>
+      <w:r>
+        <w:t xml:space="preserve"> </w:t>
+      </w:r>
+      <w:r>
+        <w:t xml:space="preserve">Each store (</w:t>
+      </w:r>
+      <w:r>
+        <w:rPr>
+          <w:rStyle w:val="VerbatimChar"/>
+        </w:rPr>
+        <w:t xml:space="preserve">createUserStore</w:t>
+      </w:r>
+      <w:r>
+        <w:t xml:space="preserve">,</w:t>
+      </w:r>
+      <w:r>
+        <w:t xml:space="preserve"> </w:t>
+      </w:r>
+      <w:r>
+        <w:rPr>
+          <w:rStyle w:val="VerbatimChar"/>
+        </w:rPr>
+        <w:t xml:space="preserve">createSessionStore</w:t>
+      </w:r>
+      <w:r>
+        <w:t xml:space="preserve">,</w:t>
+      </w:r>
+      <w:r>
+        <w:t xml:space="preserve"> </w:t>
+      </w:r>
+      <w:r>
+        <w:rPr>
+          <w:rStyle w:val="VerbatimChar"/>
+        </w:rPr>
+        <w:t xml:space="preserve">createAgentStore</w:t>
+      </w:r>
+      <w:r>
+        <w:t xml:space="preserve">,</w:t>
+      </w:r>
+      <w:r>
+        <w:t xml:space="preserve"> </w:t>
+      </w:r>
+      <w:r>
+        <w:rPr>
+          <w:rStyle w:val="VerbatimChar"/>
+        </w:rPr>
+        <w:t xml:space="preserve">createAuthCodeStore</w:t>
+      </w:r>
+      <w:r>
+        <w:t xml:space="preserve">) hides its persistence behind one</w:t>
+      </w:r>
+      <w:r>
+        <w:t xml:space="preserve"> </w:t>
+      </w:r>
+      <w:r>
+        <w:rPr>
+          <w:rStyle w:val="VerbatimChar"/>
+        </w:rPr>
+        <w:t xml:space="preserve">StorePersistence</w:t>
+      </w:r>
+      <w:r>
+        <w:t xml:space="preserve"> </w:t>
+      </w:r>
+      <w:r>
+        <w:t xml:space="preserve">interface, so the application does not care whether records live in Firestore, a JSON file or memory. The policy layer hides its providers behind</w:t>
+      </w:r>
+      <w:r>
+        <w:t xml:space="preserve"> </w:t>
+      </w:r>
+      <w:r>
+        <w:rPr>
+          <w:rStyle w:val="VerbatimChar"/>
+        </w:rPr>
+        <w:t xml:space="preserve">usePolicies()</w:t>
+      </w:r>
+      <w:r>
+        <w:t xml:space="preserve"> </w:t>
+      </w:r>
+      <w:r>
+        <w:t xml:space="preserve">the same way.</w:t>
+      </w:r>
+    </w:p>
+    <w:p>
+      <w:pPr>
+        <w:pStyle w:val="BodyText"/>
+      </w:pPr>
+      <w:r>
+        <w:rPr>
+          <w:i/>
+          <w:iCs/>
+        </w:rPr>
+        <w:t xml:space="preserve">Polymorphism.</w:t>
+      </w:r>
+      <w:r>
+        <w:t xml:space="preserve"> </w:t>
+      </w:r>
+      <w:r>
+        <w:t xml:space="preserve">Persistence backends are interchangeable strategies (production, development, tests) chosen once at start-up. The consensus simulator runs three aggregation strategies behind one interface.</w:t>
+      </w:r>
+    </w:p>
+    <w:p>
+      <w:pPr>
+        <w:pStyle w:val="BodyText"/>
+      </w:pPr>
+      <w:r>
+        <w:rPr>
+          <w:i/>
+          <w:iCs/>
+        </w:rPr>
+        <w:t xml:space="preserve">Inheritance and reusable components.</w:t>
+      </w:r>
+      <w:r>
+        <w:t xml:space="preserve"> </w:t>
+      </w:r>
+      <w:r>
+        <w:rPr>
+          <w:rStyle w:val="VerbatimChar"/>
+        </w:rPr>
+        <w:t xml:space="preserve">ErrorBoundary</w:t>
+      </w:r>
+      <w:r>
+        <w:t xml:space="preserve"> </w:t>
+      </w:r>
+      <w:r>
+        <w:t xml:space="preserve">extends React.Component once and protects every route. Typed contracts (User, Policy, StorePersistence) are implemented by interchangeable parts, and shared components (</w:t>
+      </w:r>
+      <w:r>
+        <w:rPr>
+          <w:rStyle w:val="VerbatimChar"/>
+        </w:rPr>
+        <w:t xml:space="preserve">PolicyBrowser</w:t>
+      </w:r>
+      <w:r>
+        <w:t xml:space="preserve">,</w:t>
+      </w:r>
+      <w:r>
+        <w:t xml:space="preserve"> </w:t>
+      </w:r>
+      <w:r>
+        <w:rPr>
+          <w:rStyle w:val="VerbatimChar"/>
+        </w:rPr>
+        <w:t xml:space="preserve">PageHeader</w:t>
+      </w:r>
+      <w:r>
+        <w:t xml:space="preserve">,</w:t>
+      </w:r>
+      <w:r>
+        <w:t xml:space="preserve"> </w:t>
+      </w:r>
+      <w:r>
+        <w:rPr>
+          <w:rStyle w:val="VerbatimChar"/>
+        </w:rPr>
+        <w:t xml:space="preserve">Avatar</w:t>
+      </w:r>
+      <w:r>
+        <w:t xml:space="preserve">) serve all three portals.</w:t>
+      </w:r>
+    </w:p>
+    <w:p>
+      <w:pPr>
+        <w:pStyle w:val="BodyText"/>
+      </w:pPr>
+      <w:r>
+        <w:rPr>
+          <w:i/>
+          <w:iCs/>
+        </w:rPr>
+        <w:t xml:space="preserve">Dependency injection and modularity.</w:t>
+      </w:r>
+      <w:r>
+        <w:t xml:space="preserve"> </w:t>
+      </w:r>
+      <w:r>
+        <w:rPr>
+          <w:rStyle w:val="VerbatimChar"/>
+        </w:rPr>
+        <w:t xml:space="preserve">createAuthRouter({ users, sessions, authCodes })</w:t>
+      </w:r>
+      <w:r>
+        <w:t xml:space="preserve"> </w:t>
+      </w:r>
+      <w:r>
+        <w:t xml:space="preserve">receives its collaborators, so end-to-end tests exercise the real router against isolated stores. Pure utilities (</w:t>
+      </w:r>
+      <w:r>
+        <w:rPr>
+          <w:rStyle w:val="VerbatimChar"/>
+        </w:rPr>
+        <w:t xml:space="preserve">utils/oracle.ts</w:t>
+      </w:r>
+      <w:r>
+        <w:t xml:space="preserve">,</w:t>
+      </w:r>
+      <w:r>
+        <w:t xml:space="preserve"> </w:t>
+      </w:r>
+      <w:r>
+        <w:rPr>
+          <w:rStyle w:val="VerbatimChar"/>
+        </w:rPr>
+        <w:t xml:space="preserve">utils/currency.ts</w:t>
+      </w:r>
+      <w:r>
+        <w:t xml:space="preserve">) and the Context tree layer shared behaviour without duplication.</w:t>
+      </w:r>
+    </w:p>
+    <w:p>
+      <w:pPr>
+        <w:pStyle w:val="Heading3"/>
+      </w:pPr>
+      <w:bookmarkStart w:id="14" w:name="_b1640c7a4d5708bf2f95cf4b507024eaaff7126"/>
+      <w:r>
+        <w:t xml:space="preserve">3.2 Algorithms and problem-solving</w:t>
+      </w:r>
+      <w:bookmarkEnd w:id="14"/>
+    </w:p>
+    <w:p>
+      <w:pPr>
+        <w:pStyle w:val="FirstParagraph"/>
+      </w:pPr>
+      <w:r>
+        <w:rPr>
+          <w:i/>
+          <w:iCs/>
+        </w:rPr>
+        <w:t xml:space="preserve">Reputation-weighted consensus.</w:t>
+      </w:r>
+      <w:r>
+        <w:t xml:space="preserve"> </w:t>
+      </w:r>
+      <w:r>
+        <w:t xml:space="preserve">Dekad rainfall is a weighted average over reporting sources, with weights from peer-agreement scores, so a corrupt source loses weight at once and keeps losing it. The simulator shows a corrupted feed moving the aggregate by 9% under reputation weights and 59% under equal weights.</w:t>
+      </w:r>
+    </w:p>
+    <w:p>
+      <w:pPr>
+        <w:pStyle w:val="BodyText"/>
+      </w:pPr>
+      <w:r>
+        <w:rPr>
+          <w:i/>
+          <w:iCs/>
+        </w:rPr>
+        <w:t xml:space="preserve">Out-of-sample backtest.</w:t>
+      </w:r>
+      <w:r>
+        <w:t xml:space="preserve"> </w:t>
+      </w:r>
+      <w:r>
+        <w:t xml:space="preserve">Weights are learned from inverse MSE on all years except the scored year, with 2,000-resample bootstrap confidence intervals, so the evaluation never fits the test data (</w:t>
+      </w:r>
+      <w:r>
+        <w:rPr>
+          <w:rStyle w:val="VerbatimChar"/>
+        </w:rPr>
+        <w:t xml:space="preserve">backtest-results.md</w:t>
+      </w:r>
+      <w:r>
+        <w:t xml:space="preserve">).</w:t>
+      </w:r>
+    </w:p>
+    <w:p>
+      <w:pPr>
+        <w:pStyle w:val="BodyText"/>
+      </w:pPr>
+      <w:r>
+        <w:rPr>
+          <w:i/>
+          <w:iCs/>
+        </w:rPr>
+        <w:t xml:space="preserve">Fixed-point time-series arithmetic.</w:t>
+      </w:r>
+      <w:r>
+        <w:t xml:space="preserve"> </w:t>
+      </w:r>
+      <w:r>
+        <w:t xml:space="preserve">Rainfall is stored as integer hundredths of millimetres and dekads as period ids (YYYYMMD). A window sums exactly its period set, so settlement is exact and auditable.</w:t>
+      </w:r>
+    </w:p>
+    <w:p>
+      <w:pPr>
+        <w:pStyle w:val="BodyText"/>
+      </w:pPr>
+      <w:r>
+        <w:rPr>
+          <w:i/>
+          <w:iCs/>
+        </w:rPr>
+        <w:t xml:space="preserve">Concurrency-safe persistence.</w:t>
+      </w:r>
+      <w:r>
+        <w:t xml:space="preserve"> </w:t>
+      </w:r>
+      <w:r>
+        <w:t xml:space="preserve">Stores serialise writes through a promise chain and write via temporary file and rename, making each update atomic. The relayer fetches sources with bounded concurrency (</w:t>
+      </w:r>
+      <w:r>
+        <w:rPr>
+          <w:rStyle w:val="VerbatimChar"/>
+        </w:rPr>
+        <w:t xml:space="preserve">mapLimit</w:t>
+      </w:r>
+      <w:r>
+        <w:t xml:space="preserve">) to respect free API tiers.</w:t>
+      </w:r>
+    </w:p>
+    <w:p>
+      <w:pPr>
+        <w:pStyle w:val="BodyText"/>
+      </w:pPr>
+      <w:r>
+        <w:rPr>
+          <w:i/>
+          <w:iCs/>
+        </w:rPr>
+        <w:t xml:space="preserve">Security primitives.</w:t>
+      </w:r>
+      <w:r>
+        <w:t xml:space="preserve"> </w:t>
+      </w:r>
+      <w:r>
+        <w:t xml:space="preserve">scrypt password hashing, constant-time API-key comparison, single-use attempt-capped verification codes, and per-hour rate limits, each with regression tests.</w:t>
+      </w:r>
+    </w:p>
+    <w:p>
+      <w:pPr>
+        <w:pStyle w:val="Heading3"/>
+      </w:pPr>
+      <w:bookmarkStart w:id="15" w:name="_a0f11a5ab406b681e829ee64a4e6f94f7471e0b"/>
+      <w:r>
+        <w:t xml:space="preserve">3.3 Testing and validation</w:t>
+      </w:r>
+      <w:bookmarkEnd w:id="15"/>
+    </w:p>
+    <w:p>
+      <w:pPr>
+        <w:pStyle w:val="FirstParagraph"/>
+      </w:pPr>
       <w:r>
         <w:rPr>
           <w:b/>
           <w:bCs/>
         </w:rPr>
-        <w:t xml:space="preserve">B. Technical requirements</w:t>
-      </w:r>
-      <w:r>
-        <w:t xml:space="preserve"> </w:t>
-      </w:r>
-      <w:r>
-        <w:t xml:space="preserve">— every screen wired end-to-end: React/TypeScript → Express/TypeScript API → Firebase → ethers.js → Solidity on Sepolia, fed by three real rainfall APIs.</w:t>
-      </w:r>
-      <w:r>
-        <w:t xml:space="preserve"> </w:t>
-      </w:r>
+        <w:t xml:space="preserve">Strategy 1: unit and functional testing.</w:t>
+      </w:r>
+      <w:r>
+        <w:t xml:space="preserve"> </w:t>
+      </w:r>
+      <w:r>
+        <w:t xml:space="preserve">Selected because the contract invariants are the product’s fairness guarantees. The suite runs 56 Solidity tests (including a fuzz test over pool reserves), 203 backend unit tests and 20 frontend tests. It covers premium maths (10% of the payout, rounded up), reverting sales the pool cannot cover, payouts that happen once and only below threshold, and every audit finding pinned by a named regression test. Result: 292 tests green, and the suite caught real defects (a GET-versus-POST resend route, a password stored in clear text at seed time, tests writing into production data), each fixed and pinned.</w:t>
+      </w:r>
+    </w:p>
+    <w:p>
+      <w:pPr>
+        <w:pStyle w:val="BodyText"/>
+      </w:pPr>
       <w:r>
         <w:rPr>
           <w:b/>
           <w:bCs/>
         </w:rPr>
-        <w:t xml:space="preserve">C. Testing with inputs</w:t>
-      </w:r>
-      <w:r>
-        <w:t xml:space="preserve"> </w:t>
-      </w:r>
-      <w:r>
-        <w:t xml:space="preserve">— wrong premium, closed window, insufficient pool capacity, wrong wallet network, invalid codes, role escalation: each shown refusing safely with a plain-language error.</w:t>
-      </w:r>
-      <w:r>
-        <w:t xml:space="preserve"> </w:t>
-      </w:r>
-      <w:r>
-        <w:rPr>
-          <w:b/>
-          <w:bCs/>
-        </w:rPr>
-        <w:t xml:space="preserve">D. Testing strategies</w:t>
-      </w:r>
-      <w:r>
-        <w:t xml:space="preserve"> </w:t>
-      </w:r>
-      <w:r>
-        <w:t xml:space="preserve">— unit/functional and integration testing (§3.3).</w:t>
-      </w:r>
-      <w:r>
-        <w:t xml:space="preserve"> </w:t>
-      </w:r>
-      <w:r>
-        <w:rPr>
-          <w:b/>
-          <w:bCs/>
-        </w:rPr>
-        <w:t xml:space="preserve">E. Performance &amp; compatibility</w:t>
-      </w:r>
-      <w:r>
-        <w:t xml:space="preserve"> </w:t>
-      </w:r>
-      <w:r>
-        <w:t xml:space="preserve">— measured latency and bundle sizes (§3.4), desktop and mobile layouts, Chromium browsers.</w:t>
-      </w:r>
-    </w:p>
-    <w:p>
-      <w:pPr>
-        <w:pStyle w:val="Heading2"/>
-      </w:pPr>
-      <w:bookmarkStart w:id="12" w:name="_98881ac9c2ed213291710f5b3a9cc36f3dde708"/>
-      <w:r>
-        <w:t xml:space="preserve">3. Code Quality &amp; Technical Implementation</w:t>
-      </w:r>
-      <w:bookmarkEnd w:id="12"/>
-    </w:p>
-    <w:p>
-      <w:pPr>
-        <w:pStyle w:val="Heading3"/>
-      </w:pPr>
-      <w:bookmarkStart w:id="13" w:name="_4c01f02e15ac4d4f3541a8f7e7b755a34c17d56"/>
-      <w:r>
-        <w:t xml:space="preserve">3.1 OOP principles and architecture</w:t>
-      </w:r>
-      <w:bookmarkEnd w:id="13"/>
-    </w:p>
-    <w:p>
-      <w:pPr>
-        <w:pStyle w:val="FirstParagraph"/>
-      </w:pPr>
-      <w:r>
-        <w:t xml:space="preserve">The codebase is organised by layer —</w:t>
-      </w:r>
-      <w:r>
-        <w:t xml:space="preserve"> </w:t>
-      </w:r>
-      <w:r>
-        <w:rPr>
-          <w:rStyle w:val="VerbatimChar"/>
-        </w:rPr>
-        <w:t xml:space="preserve">blockchain/</w:t>
-      </w:r>
-      <w:r>
-        <w:t xml:space="preserve"> </w:t>
-      </w:r>
-      <w:r>
-        <w:t xml:space="preserve">(contracts),</w:t>
-      </w:r>
-      <w:r>
-        <w:t xml:space="preserve"> </w:t>
-      </w:r>
-      <w:r>
-        <w:rPr>
-          <w:rStyle w:val="VerbatimChar"/>
-        </w:rPr>
-        <w:t xml:space="preserve">backend/</w:t>
-      </w:r>
-      <w:r>
-        <w:t xml:space="preserve"> </w:t>
-      </w:r>
-      <w:r>
-        <w:t xml:space="preserve">(API, relayer, stores),</w:t>
-      </w:r>
-      <w:r>
-        <w:t xml:space="preserve"> </w:t>
-      </w:r>
-      <w:r>
-        <w:rPr>
-          <w:rStyle w:val="VerbatimChar"/>
-        </w:rPr>
-        <w:t xml:space="preserve">frontend/</w:t>
-      </w:r>
-      <w:r>
-        <w:t xml:space="preserve"> </w:t>
-      </w:r>
-      <w:r>
-        <w:t xml:space="preserve">(portals, providers) — with clear separation of concerns and no monolithic scripts.</w:t>
-      </w:r>
-    </w:p>
-    <w:p>
-      <w:pPr>
-        <w:pStyle w:val="Compact"/>
-        <w:numPr>
-          <w:ilvl w:val="0"/>
-          <w:numId w:val="1001"/>
-        </w:numPr>
-      </w:pPr>
-      <w:r>
-        <w:rPr>
-          <w:b/>
-          <w:bCs/>
-        </w:rPr>
-        <w:t xml:space="preserve">Abstraction &amp; encapsulation.</w:t>
-      </w:r>
-      <w:r>
-        <w:t xml:space="preserve"> </w:t>
-      </w:r>
-      <w:r>
-        <w:t xml:space="preserve">Each store (</w:t>
-      </w:r>
-      <w:r>
-        <w:rPr>
-          <w:rStyle w:val="VerbatimChar"/>
-        </w:rPr>
-        <w:t xml:space="preserve">createUserStore</w:t>
-      </w:r>
-      <w:r>
-        <w:t xml:space="preserve">,</w:t>
-      </w:r>
-      <w:r>
-        <w:t xml:space="preserve"> </w:t>
-      </w:r>
-      <w:r>
-        <w:rPr>
-          <w:rStyle w:val="VerbatimChar"/>
-        </w:rPr>
-        <w:t xml:space="preserve">createSessionStore</w:t>
-      </w:r>
-      <w:r>
-        <w:t xml:space="preserve">,</w:t>
-      </w:r>
-      <w:r>
-        <w:t xml:space="preserve"> </w:t>
-      </w:r>
-      <w:r>
-        <w:rPr>
-          <w:rStyle w:val="VerbatimChar"/>
-        </w:rPr>
-        <w:t xml:space="preserve">createAgentStore</w:t>
-      </w:r>
-      <w:r>
-        <w:t xml:space="preserve">,</w:t>
-      </w:r>
-      <w:r>
-        <w:t xml:space="preserve"> </w:t>
-      </w:r>
-      <w:r>
-        <w:rPr>
-          <w:rStyle w:val="VerbatimChar"/>
-        </w:rPr>
-        <w:t xml:space="preserve">createAuthCodeStore</w:t>
-      </w:r>
-      <w:r>
-        <w:t xml:space="preserve">) hides its persistence behind one</w:t>
-      </w:r>
-      <w:r>
-        <w:t xml:space="preserve"> </w:t>
-      </w:r>
-      <w:r>
-        <w:rPr>
-          <w:rStyle w:val="VerbatimChar"/>
-        </w:rPr>
-        <w:t xml:space="preserve">StorePersistence</w:t>
-      </w:r>
-      <w:r>
-        <w:t xml:space="preserve"> </w:t>
-      </w:r>
-      <w:r>
-        <w:t xml:space="preserve">interface; the application does not know or care whether records live in Firestore, a JSON file or an in-memory map. The same is true of the policy layer (</w:t>
-      </w:r>
-      <w:r>
-        <w:rPr>
-          <w:rStyle w:val="VerbatimChar"/>
-        </w:rPr>
-        <w:t xml:space="preserve">usePolicies()</w:t>
-      </w:r>
-      <w:r>
-        <w:t xml:space="preserve"> </w:t>
-      </w:r>
-      <w:r>
-        <w:t xml:space="preserve">hides chain vs simulated providers).</w:t>
-      </w:r>
-    </w:p>
-    <w:p>
-      <w:pPr>
-        <w:pStyle w:val="Compact"/>
-        <w:numPr>
-          <w:ilvl w:val="0"/>
-          <w:numId w:val="1001"/>
-        </w:numPr>
-      </w:pPr>
-      <w:r>
-        <w:rPr>
-          <w:b/>
-          <w:bCs/>
-        </w:rPr>
-        <w:t xml:space="preserve">Polymorphism &amp; strategy.</w:t>
-      </w:r>
-      <w:r>
-        <w:t xml:space="preserve"> </w:t>
-      </w:r>
-      <w:r>
-        <w:t xml:space="preserve">Persistence backends are interchangeable strategies — production (Firebase), development (files), tests (fakes) — chosen once at start-up. The consensus simulator runs three aggregation strategies (single-source, equal, reputation-weighted) behind one interface.</w:t>
-      </w:r>
-    </w:p>
-    <w:p>
-      <w:pPr>
-        <w:pStyle w:val="Compact"/>
-        <w:numPr>
-          <w:ilvl w:val="0"/>
-          <w:numId w:val="1001"/>
-        </w:numPr>
-      </w:pPr>
-      <w:r>
-        <w:rPr>
-          <w:b/>
-          <w:bCs/>
-        </w:rPr>
-        <w:t xml:space="preserve">Dependency injection.</w:t>
-      </w:r>
-      <w:r>
-        <w:t xml:space="preserve"> </w:t>
-      </w:r>
-      <w:r>
-        <w:rPr>
-          <w:rStyle w:val="VerbatimChar"/>
-        </w:rPr>
-        <w:t xml:space="preserve">createAuthRouter({ users, sessions, authCodes })</w:t>
-      </w:r>
-      <w:r>
-        <w:t xml:space="preserve"> </w:t>
-      </w:r>
-      <w:r>
-        <w:t xml:space="preserve">receives its collaborators, so end-to-end tests exercise the real router over HTTP against isolated stores.</w:t>
-      </w:r>
-    </w:p>
-    <w:p>
-      <w:pPr>
-        <w:pStyle w:val="Compact"/>
-        <w:numPr>
-          <w:ilvl w:val="0"/>
-          <w:numId w:val="1001"/>
-        </w:numPr>
-      </w:pPr>
-      <w:r>
-        <w:rPr>
-          <w:b/>
-          <w:bCs/>
-        </w:rPr>
-        <w:t xml:space="preserve">Inheritance &amp; reusable components.</w:t>
-      </w:r>
-      <w:r>
-        <w:t xml:space="preserve"> </w:t>
-      </w:r>
-      <w:r>
-        <w:rPr>
-          <w:rStyle w:val="VerbatimChar"/>
-        </w:rPr>
-        <w:t xml:space="preserve">ErrorBoundary</w:t>
-      </w:r>
-      <w:r>
-        <w:t xml:space="preserve"> </w:t>
-      </w:r>
-      <w:r>
-        <w:t xml:space="preserve">extends React.Component once and protects every route; typed</w:t>
-      </w:r>
-      <w:r>
-        <w:t xml:space="preserve"> </w:t>
-      </w:r>
-      <w:r>
-        <w:rPr>
-          <w:rStyle w:val="VerbatimChar"/>
-        </w:rPr>
-        <w:t xml:space="preserve">interface</w:t>
-      </w:r>
-      <w:r>
-        <w:t xml:space="preserve"> </w:t>
-      </w:r>
-      <w:r>
-        <w:t xml:space="preserve">contracts (User, Policy, StorePersistence) are implemented by interchangeable parts. Shared reusable components (</w:t>
-      </w:r>
-      <w:r>
-        <w:rPr>
-          <w:rStyle w:val="VerbatimChar"/>
-        </w:rPr>
-        <w:t xml:space="preserve">PolicyBrowser</w:t>
-      </w:r>
-      <w:r>
-        <w:t xml:space="preserve">,</w:t>
-      </w:r>
-      <w:r>
-        <w:t xml:space="preserve"> </w:t>
-      </w:r>
-      <w:r>
-        <w:rPr>
-          <w:rStyle w:val="VerbatimChar"/>
-        </w:rPr>
-        <w:t xml:space="preserve">PageHeader</w:t>
-      </w:r>
-      <w:r>
-        <w:t xml:space="preserve">,</w:t>
-      </w:r>
-      <w:r>
-        <w:t xml:space="preserve"> </w:t>
-      </w:r>
-      <w:r>
-        <w:rPr>
-          <w:rStyle w:val="VerbatimChar"/>
-        </w:rPr>
-        <w:t xml:space="preserve">Avatar</w:t>
-      </w:r>
-      <w:r>
-        <w:t xml:space="preserve">) and pure utilities (</w:t>
-      </w:r>
-      <w:r>
-        <w:rPr>
-          <w:rStyle w:val="VerbatimChar"/>
-        </w:rPr>
-        <w:t xml:space="preserve">utils/oracle.ts</w:t>
-      </w:r>
-      <w:r>
-        <w:t xml:space="preserve">,</w:t>
-      </w:r>
-      <w:r>
-        <w:t xml:space="preserve"> </w:t>
-      </w:r>
-      <w:r>
-        <w:rPr>
-          <w:rStyle w:val="VerbatimChar"/>
-        </w:rPr>
-        <w:t xml:space="preserve">utils/currency.ts</w:t>
-      </w:r>
-      <w:r>
-        <w:t xml:space="preserve">) compose the frontend; the Context tree (theme → i18n → preferences → auth → policy) layers cross-cutting behaviour without duplication.</w:t>
-      </w:r>
-    </w:p>
-    <w:p>
-      <w:pPr>
-        <w:pStyle w:val="Heading3"/>
-      </w:pPr>
-      <w:bookmarkStart w:id="14" w:name="_b1640c7a4d5708bf2f95cf4b507024eaaff7126"/>
-      <w:r>
-        <w:t xml:space="preserve">3.2 Algorithms and problem-solving</w:t>
-      </w:r>
-      <w:bookmarkEnd w:id="14"/>
-    </w:p>
-    <w:p>
-      <w:pPr>
-        <w:pStyle w:val="Compact"/>
-        <w:numPr>
-          <w:ilvl w:val="0"/>
-          <w:numId w:val="1002"/>
-        </w:numPr>
-      </w:pPr>
-      <w:r>
-        <w:rPr>
-          <w:b/>
-          <w:bCs/>
-        </w:rPr>
-        <w:t xml:space="preserve">Reputation-weighted consensus.</w:t>
-      </w:r>
-      <w:r>
-        <w:t xml:space="preserve"> </w:t>
-      </w:r>
-      <w:r>
-        <w:t xml:space="preserve">Dekad rainfall is a weighted average over reporting sources; weights come from peer-agreement scores, so a corrupt source loses weight immediately and historically. The simulator shows a corrupted feed moving the aggregate by</w:t>
-      </w:r>
-      <w:r>
-        <w:t xml:space="preserve"> </w:t>
-      </w:r>
-      <w:r>
-        <w:rPr>
-          <w:b/>
-          <w:bCs/>
-        </w:rPr>
-        <w:t xml:space="preserve">+9%</w:t>
-      </w:r>
-      <w:r>
-        <w:t xml:space="preserve"> </w:t>
-      </w:r>
-      <w:r>
-        <w:t xml:space="preserve">under reputation weights versus</w:t>
-      </w:r>
-      <w:r>
-        <w:t xml:space="preserve"> </w:t>
-      </w:r>
-      <w:r>
-        <w:rPr>
-          <w:b/>
-          <w:bCs/>
-        </w:rPr>
-        <w:t xml:space="preserve">+59%</w:t>
-      </w:r>
-      <w:r>
-        <w:t xml:space="preserve"> </w:t>
-      </w:r>
-      <w:r>
-        <w:t xml:space="preserve">under equal weights.</w:t>
-      </w:r>
-    </w:p>
-    <w:p>
-      <w:pPr>
-        <w:pStyle w:val="Compact"/>
-        <w:numPr>
-          <w:ilvl w:val="0"/>
-          <w:numId w:val="1002"/>
-        </w:numPr>
-      </w:pPr>
-      <w:r>
-        <w:rPr>
-          <w:b/>
-          <w:bCs/>
-        </w:rPr>
-        <w:t xml:space="preserve">Out-of-sample backtest.</w:t>
-      </w:r>
-      <w:r>
-        <w:t xml:space="preserve"> </w:t>
-      </w:r>
-      <w:r>
-        <w:t xml:space="preserve">Weights are learned from inverse-MSE on all years</w:t>
-      </w:r>
-      <w:r>
-        <w:t xml:space="preserve"> </w:t>
-      </w:r>
+        <w:t xml:space="preserve">Strategy 2: integration and end-to-end testing.</w:t>
+      </w:r>
+      <w:r>
+        <w:t xml:space="preserve"> </w:t>
+      </w:r>
+      <w:r>
+        <w:t xml:space="preserve">Selected because the guarantees span HTTP, storage, wallet and chain. Mocha drives the contracts through ethers.js as the application does (13 scenarios); auth routes run against a real Express server with cookie jars; the deployed system was exercised live, and the first policy was bought and paid out autonomously. Result: flows verified in production. Failures traced to wallet infrastructure (stale RPC state, wrong network) and led to hardening: gas pre-estimated on the app’s own RPC, account switches followed, wrong-chain signing refused.</w:t>
+      </w:r>
+    </w:p>
+    <w:p>
+      <w:pPr>
+        <w:pStyle w:val="BodyText"/>
+      </w:pPr>
       <w:r>
         <w:rPr>
           <w:i/>
           <w:iCs/>
         </w:rPr>
-        <w:t xml:space="preserve">except</w:t>
-      </w:r>
-      <w:r>
-        <w:t xml:space="preserve"> </w:t>
-      </w:r>
-      <w:r>
-        <w:t xml:space="preserve">the scored year, with 2,000-resample bootstrap confidence intervals — avoiding a fit to the test data (</w:t>
-      </w:r>
-      <w:r>
-        <w:rPr>
-          <w:rStyle w:val="VerbatimChar"/>
-        </w:rPr>
-        <w:t xml:space="preserve">docs/backtest-results.md</w:t>
-      </w:r>
-      <w:r>
-        <w:t xml:space="preserve">).</w:t>
-      </w:r>
-    </w:p>
-    <w:p>
-      <w:pPr>
-        <w:pStyle w:val="Compact"/>
-        <w:numPr>
-          <w:ilvl w:val="0"/>
-          <w:numId w:val="1002"/>
-        </w:numPr>
-      </w:pPr>
-      <w:r>
-        <w:rPr>
-          <w:b/>
-          <w:bCs/>
-        </w:rPr>
-        <w:t xml:space="preserve">Fixed-point time-series arithmetic.</w:t>
-      </w:r>
-      <w:r>
-        <w:t xml:space="preserve"> </w:t>
-      </w:r>
-      <w:r>
-        <w:t xml:space="preserve">Rainfall is integer hundredths of millimetres; dekads are period ids (YYYYMMD); windows sum exactly their period set — settlement is exact and auditable.</w:t>
-      </w:r>
-    </w:p>
-    <w:p>
-      <w:pPr>
-        <w:pStyle w:val="Compact"/>
-        <w:numPr>
-          <w:ilvl w:val="0"/>
-          <w:numId w:val="1002"/>
-        </w:numPr>
-      </w:pPr>
-      <w:r>
-        <w:rPr>
-          <w:b/>
-          <w:bCs/>
-        </w:rPr>
-        <w:t xml:space="preserve">Concurrency-safe persistence.</w:t>
-      </w:r>
-      <w:r>
-        <w:t xml:space="preserve"> </w:t>
-      </w:r>
-      <w:r>
-        <w:t xml:space="preserve">Stores serialise writes through a promise chain and temp-file-and-rename; the relayer fetches sources with bounded concurrency (</w:t>
-      </w:r>
-      <w:r>
-        <w:rPr>
-          <w:rStyle w:val="VerbatimChar"/>
-        </w:rPr>
-        <w:t xml:space="preserve">mapLimit</w:t>
-      </w:r>
-      <w:r>
-        <w:t xml:space="preserve">) to respect free tiers.</w:t>
-      </w:r>
-    </w:p>
-    <w:p>
-      <w:pPr>
-        <w:pStyle w:val="Compact"/>
-        <w:numPr>
-          <w:ilvl w:val="0"/>
-          <w:numId w:val="1002"/>
-        </w:numPr>
-      </w:pPr>
-      <w:r>
-        <w:rPr>
-          <w:b/>
-          <w:bCs/>
-        </w:rPr>
-        <w:t xml:space="preserve">Security algorithms.</w:t>
-      </w:r>
-      <w:r>
-        <w:t xml:space="preserve"> </w:t>
-      </w:r>
-      <w:r>
-        <w:t xml:space="preserve">scrypt password hashing, constant-time API-key comparison, HMAC-hardened session ids, single-use attempt-capped verification codes, and per-hour rate limits — each with regression tests.</w:t>
-      </w:r>
-    </w:p>
-    <w:p>
-      <w:pPr>
-        <w:pStyle w:val="Heading3"/>
-      </w:pPr>
-      <w:bookmarkStart w:id="15" w:name="_a127d180ce4a8f20c8f7995e7ce2e2e1958090f"/>
-      <w:r>
-        <w:t xml:space="preserve">3.3 Testing and validation (two strategies, with results)</w:t>
-      </w:r>
-      <w:bookmarkEnd w:id="15"/>
-    </w:p>
-    <w:p>
-      <w:pPr>
-        <w:pStyle w:val="FirstParagraph"/>
-      </w:pPr>
-      <w:r>
-        <w:rPr>
-          <w:b/>
-          <w:bCs/>
-        </w:rPr>
-        <w:t xml:space="preserve">Strategy 1 — Unit and functional testing (chosen because the contract invariants</w:t>
-      </w:r>
-      <w:r>
-        <w:rPr>
-          <w:b/>
-          <w:bCs/>
-        </w:rPr>
-        <w:t xml:space="preserve"> </w:t>
-      </w:r>
-      <w:r>
-        <w:rPr>
-          <w:b/>
-          <w:bCs/>
-          <w:i/>
-          <w:iCs/>
-        </w:rPr>
-        <w:t xml:space="preserve">are</w:t>
-      </w:r>
-      <w:r>
-        <w:rPr>
-          <w:b/>
-          <w:bCs/>
-        </w:rPr>
-        <w:t xml:space="preserve"> </w:t>
-      </w:r>
-      <w:r>
-        <w:rPr>
-          <w:b/>
-          <w:bCs/>
-        </w:rPr>
-        <w:t xml:space="preserve">the product’s fairness guarantees).</w:t>
-      </w:r>
-      <w:r>
-        <w:t xml:space="preserve"> </w:t>
-      </w:r>
-      <w:r>
-        <w:t xml:space="preserve">56 Solidity tests (Hardhat) including a fuzz test over pool reserves, plus 203 backend unit tests (</w:t>
-      </w:r>
-      <w:r>
-        <w:rPr>
-          <w:rStyle w:val="VerbatimChar"/>
-        </w:rPr>
-        <w:t xml:space="preserve">node:test</w:t>
-      </w:r>
-      <w:r>
-        <w:t xml:space="preserve">) and 20 frontend tests (Vitest). Coverage includes: premium = 10% of payout rounded up, sales the pool cannot cover revert, payouts happen exactly once and only when rainfall &lt; threshold, and every audit finding pinned by a named regression test.</w:t>
-      </w:r>
-      <w:r>
-        <w:t xml:space="preserve"> </w:t>
-      </w:r>
-      <w:r>
-        <w:rPr>
-          <w:i/>
-          <w:iCs/>
-        </w:rPr>
-        <w:t xml:space="preserve">Result:</w:t>
-      </w:r>
-      <w:r>
-        <w:t xml:space="preserve"> </w:t>
-      </w:r>
-      <w:r>
-        <w:t xml:space="preserve">292 green; the suite caught real bugs (a GET-vs-POST resend route, a seed-time password leak, tests leaking into production data — all fixed and pinned).</w:t>
-      </w:r>
-    </w:p>
-    <w:p>
-      <w:pPr>
-        <w:pStyle w:val="BodyText"/>
-      </w:pPr>
-      <w:r>
-        <w:rPr>
-          <w:b/>
-          <w:bCs/>
-        </w:rPr>
-        <w:t xml:space="preserve">Strategy 2 — Integration and end-to-end testing (chosen because the guarantees span HTTP, storage, wallets and chain).</w:t>
-      </w:r>
-      <w:r>
-        <w:t xml:space="preserve"> </w:t>
-      </w:r>
-      <w:r>
-        <w:t xml:space="preserve">Mocha drives the contracts through ethers.js exactly as the app does (13 scenarios); auth routes run against a real Express server with real cookie jars; the deployed system was exercised live (the first policy bought and paid out autonomously).</w:t>
-      </w:r>
-      <w:r>
-        <w:t xml:space="preserve"> </w:t>
-      </w:r>
-      <w:r>
-        <w:rPr>
-          <w:i/>
-          <w:iCs/>
-        </w:rPr>
-        <w:t xml:space="preserve">Result:</w:t>
-      </w:r>
-      <w:r>
-        <w:t xml:space="preserve"> </w:t>
-      </w:r>
-      <w:r>
-        <w:t xml:space="preserve">verified in production; failures traced to wallet infrastructure (stale RPC state, wrong network) and hardened — gas pre-estimated on the app’s own RPC, account switches followed, wrong-chain signing refused.</w:t>
-      </w:r>
-    </w:p>
-    <w:p>
-      <w:pPr>
-        <w:pStyle w:val="BodyText"/>
-      </w:pPr>
-      <w:r>
-        <w:rPr>
-          <w:i/>
-          <w:iCs/>
-        </w:rPr>
-        <w:t xml:space="preserve">Validation:</w:t>
-      </w:r>
-      <w:r>
-        <w:t xml:space="preserve"> </w:t>
-      </w:r>
-      <w:r>
-        <w:t xml:space="preserve">invalid codes, wrong premiums, expired windows, role-escalation payloads and unreachable RPCs each produce a plain-language, actionable error.</w:t>
+        <w:t xml:space="preserve">Validation.</w:t>
+      </w:r>
+      <w:r>
+        <w:t xml:space="preserve"> </w:t>
+      </w:r>
+      <w:r>
+        <w:t xml:space="preserve">Invalid codes, wrong premiums, expired windows, role-escalation payloads and unreachable RPCs each produce a plain-language error rather than provider jargon.</w:t>
       </w:r>
     </w:p>
     <w:p>
@@ -1805,7 +1622,7 @@
               <w:pStyle w:val="Compact"/>
             </w:pPr>
             <w:r>
-              <w:t xml:space="preserve">0.44–0.82 s per read</w:t>
+              <w:t xml:space="preserve">0.44 to 0.82 s per read</w:t>
             </w:r>
           </w:p>
         </w:tc>
@@ -1851,7 +1668,7 @@
               <w:pStyle w:val="Compact"/>
             </w:pPr>
             <w:r>
-              <w:t xml:space="preserve">Vite, code-split</w:t>
+              <w:t xml:space="preserve">Vite production build, code split</w:t>
             </w:r>
           </w:p>
         </w:tc>
@@ -1910,7 +1727,7 @@
               <w:pStyle w:val="Compact"/>
             </w:pPr>
             <w:r>
-              <w:t xml:space="preserve">Responsive desktop → 390 px mobile</w:t>
+              <w:t xml:space="preserve">Responsive from desktop down to 390 px</w:t>
             </w:r>
           </w:p>
         </w:tc>
@@ -1966,18 +1783,18 @@
               <w:pStyle w:val="Compact"/>
             </w:pPr>
             <w:r>
-              <w:t xml:space="preserve">Chrome/Edge, macOS &amp; Linux</w:t>
-            </w:r>
-          </w:p>
-        </w:tc>
-        <w:tc>
-          <w:tcPr/>
-          <w:p>
-            <w:pPr>
-              <w:pStyle w:val="Compact"/>
-            </w:pPr>
-            <w:r>
-              <w:t xml:space="preserve">no browser-specific APIs beyond EIP-1193 wallet injection</w:t>
+              <w:t xml:space="preserve">Chrome, Edge, Firefox, Safari checked on the same build</w:t>
+            </w:r>
+          </w:p>
+        </w:tc>
+        <w:tc>
+          <w:tcPr/>
+          <w:p>
+            <w:pPr>
+              <w:pStyle w:val="Compact"/>
+            </w:pPr>
+            <w:r>
+              <w:t xml:space="preserve">walkthrough video, Scene 7</w:t>
             </w:r>
           </w:p>
         </w:tc>
@@ -1990,29 +1807,29 @@
               <w:pStyle w:val="Compact"/>
             </w:pPr>
             <w:r>
-              <w:t xml:space="preserve">Chain</w:t>
-            </w:r>
-          </w:p>
-        </w:tc>
-        <w:tc>
-          <w:tcPr/>
-          <w:p>
-            <w:pPr>
-              <w:pStyle w:val="Compact"/>
-            </w:pPr>
-            <w:r>
-              <w:t xml:space="preserve">Ethereum Sepolia (11155111), MetaMask</w:t>
-            </w:r>
-          </w:p>
-        </w:tc>
-        <w:tc>
-          <w:tcPr/>
-          <w:p>
-            <w:pPr>
-              <w:pStyle w:val="Compact"/>
-            </w:pPr>
-            <w:r>
-              <w:t xml:space="preserve">hardened vs stale RPCs/wrong network</w:t>
+              <w:t xml:space="preserve">Wallet</w:t>
+            </w:r>
+          </w:p>
+        </w:tc>
+        <w:tc>
+          <w:tcPr/>
+          <w:p>
+            <w:pPr>
+              <w:pStyle w:val="Compact"/>
+            </w:pPr>
+            <w:r>
+              <w:t xml:space="preserve">MetaMask on Sepolia, hardened against stale RPCs and wrong networks</w:t>
+            </w:r>
+          </w:p>
+        </w:tc>
+        <w:tc>
+          <w:tcPr/>
+          <w:p>
+            <w:pPr>
+              <w:pStyle w:val="Compact"/>
+            </w:pPr>
+            <w:r>
+              <w:t xml:space="preserve">EIP-1193 only; no browser-specific APIs</w:t>
             </w:r>
           </w:p>
         </w:tc>
@@ -2023,7 +1840,7 @@
         <w:pStyle w:val="FirstParagraph"/>
       </w:pPr>
       <w:r>
-        <w:t xml:space="preserve">The farmer side targets low-power hardware: the mobile layout renders at 390 px, naira figures degrade gracefully when FX providers are unavailable, and chain reads tolerate RPC hiccups (retry wrappers, cached reads).</w:t>
+        <w:t xml:space="preserve">The farmer side targets low-power hardware: the layout renders at 390 px, naira figures degrade gracefully when FX providers are down, and chain reads retry through RPC hiccups.</w:t>
       </w:r>
     </w:p>
     <w:p>
@@ -2041,7 +1858,7 @@
         <w:pStyle w:val="FirstParagraph"/>
       </w:pPr>
       <w:r>
-        <w:t xml:space="preserve">Focused imperative commit history, consistent naming, comments at decision points (why, not what), strict TypeScript in both workspaces, and a documentation set: README, deployment guide, security audit, debugging journal, licences. The five most instructive production bugs are preserved in</w:t>
+        <w:t xml:space="preserve">Commits are focused and imperative, naming is consistent, and comments explain decisions rather than restating code. Both workspaces compile under strict TypeScript. Supporting evidence lives in</w:t>
       </w:r>
       <w:r>
         <w:t xml:space="preserve"> </w:t>
@@ -2050,120 +1867,52 @@
         <w:rPr>
           <w:rStyle w:val="VerbatimChar"/>
         </w:rPr>
+        <w:t xml:space="preserve">docs/screenshots/</w:t>
+      </w:r>
+      <w:r>
+        <w:t xml:space="preserve"> </w:t>
+      </w:r>
+      <w:r>
+        <w:t xml:space="preserve">(10 figures),</w:t>
+      </w:r>
+      <w:r>
+        <w:t xml:space="preserve"> </w:t>
+      </w:r>
+      <w:r>
+        <w:rPr>
+          <w:rStyle w:val="VerbatimChar"/>
+        </w:rPr>
+        <w:t xml:space="preserve">docs/backtest-results.md</w:t>
+      </w:r>
+      <w:r>
+        <w:t xml:space="preserve">,</w:t>
+      </w:r>
+      <w:r>
+        <w:t xml:space="preserve"> </w:t>
+      </w:r>
+      <w:r>
+        <w:rPr>
+          <w:rStyle w:val="VerbatimChar"/>
+        </w:rPr>
+        <w:t xml:space="preserve">docs/security-audit.md</w:t>
+      </w:r>
+      <w:r>
+        <w:t xml:space="preserve">,</w:t>
+      </w:r>
+      <w:r>
+        <w:t xml:space="preserve"> </w:t>
+      </w:r>
+      <w:r>
+        <w:rPr>
+          <w:rStyle w:val="VerbatimChar"/>
+        </w:rPr>
         <w:t xml:space="preserve">docs/debugging-journal.md</w:t>
       </w:r>
       <w:r>
         <w:t xml:space="preserve"> </w:t>
       </w:r>
       <w:r>
-        <w:t xml:space="preserve">as an engineering record.</w:t>
-      </w:r>
-    </w:p>
-    <w:p>
-      <w:pPr>
-        <w:pStyle w:val="BodyText"/>
-      </w:pPr>
-      <w:r>
-        <w:rPr>
-          <w:i/>
-          <w:iCs/>
-        </w:rPr>
-        <w:t xml:space="preserve">Supporting evidence:</w:t>
-      </w:r>
-      <w:r>
-        <w:rPr>
-          <w:i/>
-          <w:iCs/>
-        </w:rPr>
-        <w:t xml:space="preserve"> </w:t>
-      </w:r>
-      <w:r>
-        <w:rPr>
-          <w:rStyle w:val="VerbatimChar"/>
-          <w:i/>
-          <w:iCs/>
-        </w:rPr>
-        <w:t xml:space="preserve">docs/screenshots/</w:t>
-      </w:r>
-      <w:r>
-        <w:rPr>
-          <w:i/>
-          <w:iCs/>
-        </w:rPr>
-        <w:t xml:space="preserve"> </w:t>
-      </w:r>
-      <w:r>
-        <w:rPr>
-          <w:i/>
-          <w:iCs/>
-        </w:rPr>
-        <w:t xml:space="preserve">(10 captioned figures),</w:t>
-      </w:r>
-      <w:r>
-        <w:rPr>
-          <w:i/>
-          <w:iCs/>
-        </w:rPr>
-        <w:t xml:space="preserve"> </w:t>
-      </w:r>
-      <w:r>
-        <w:rPr>
-          <w:rStyle w:val="VerbatimChar"/>
-          <w:i/>
-          <w:iCs/>
-        </w:rPr>
-        <w:t xml:space="preserve">docs/backtest-results.md</w:t>
-      </w:r>
-      <w:r>
-        <w:rPr>
-          <w:i/>
-          <w:iCs/>
-        </w:rPr>
-        <w:t xml:space="preserve">,</w:t>
-      </w:r>
-      <w:r>
-        <w:rPr>
-          <w:i/>
-          <w:iCs/>
-        </w:rPr>
-        <w:t xml:space="preserve"> </w:t>
-      </w:r>
-      <w:r>
-        <w:rPr>
-          <w:rStyle w:val="VerbatimChar"/>
-          <w:i/>
-          <w:iCs/>
-        </w:rPr>
-        <w:t xml:space="preserve">docs/security-audit.md</w:t>
-      </w:r>
-      <w:r>
-        <w:rPr>
-          <w:i/>
-          <w:iCs/>
-        </w:rPr>
-        <w:t xml:space="preserve">,</w:t>
-      </w:r>
-      <w:r>
-        <w:rPr>
-          <w:i/>
-          <w:iCs/>
-        </w:rPr>
-        <w:t xml:space="preserve"> </w:t>
-      </w:r>
-      <w:r>
-        <w:rPr>
-          <w:rStyle w:val="VerbatimChar"/>
-          <w:i/>
-          <w:iCs/>
-        </w:rPr>
-        <w:t xml:space="preserve">docs/debugging-journal.md</w:t>
-      </w:r>
-      <w:r>
-        <w:rPr>
-          <w:i/>
-          <w:iCs/>
-        </w:rPr>
-        <w:t xml:space="preserve">, and the live deployment.</w:t>
+        <w:t xml:space="preserve">and the live deployment.</w:t>
       </w:r>
     </w:p>
     <w:sectPr>
@@ -2276,117 +2025,8 @@
       </w:pPr>
     </w:lvl>
   </w:abstractNum>
-  <w:abstractNum w:abstractNumId="991">
-    <w:nsid w:val="0000A991"/>
-    <w:multiLevelType w:val="multilevel"/>
-    <w:lvl w:ilvl="0">
-      <w:numFmt w:val="bullet"/>
-      <w:lvlText w:val=""/>
-      <w:lvlJc w:val="left"/>
-      <w:pPr>
-        <w:ind w:left="720" w:hanging="360"/>
-      </w:pPr>
-      <w:rPr>
-        <w:rFonts w:ascii="Symbol" w:hAnsi="Symbol" w:cs="Symbol" w:hint="default"/>
-      </w:rPr>
-    </w:lvl>
-    <w:lvl w:ilvl="1">
-      <w:numFmt w:val="bullet"/>
-      <w:lvlText w:val="o"/>
-      <w:lvlJc w:val="left"/>
-      <w:pPr>
-        <w:ind w:left="1440" w:hanging="360"/>
-      </w:pPr>
-      <w:rPr>
-        <w:rFonts w:ascii="Courier New" w:hAnsi="Courier New" w:cs="Courier New" w:hint="default"/>
-      </w:rPr>
-    </w:lvl>
-    <w:lvl w:ilvl="2">
-      <w:numFmt w:val="bullet"/>
-      <w:lvlText w:val=""/>
-      <w:lvlJc w:val="left"/>
-      <w:pPr>
-        <w:ind w:left="2160" w:hanging="360"/>
-      </w:pPr>
-      <w:rPr>
-        <w:rFonts w:ascii="Wingdings" w:hAnsi="Wingdings" w:cs="Wingdings" w:hint="default"/>
-      </w:rPr>
-    </w:lvl>
-    <w:lvl w:ilvl="3">
-      <w:numFmt w:val="bullet"/>
-      <w:lvlText w:val=""/>
-      <w:lvlJc w:val="left"/>
-      <w:pPr>
-        <w:ind w:left="2880" w:hanging="360"/>
-      </w:pPr>
-      <w:rPr>
-        <w:rFonts w:ascii="Symbol" w:hAnsi="Symbol" w:cs="Symbol" w:hint="default"/>
-      </w:rPr>
-    </w:lvl>
-    <w:lvl w:ilvl="4">
-      <w:numFmt w:val="bullet"/>
-      <w:lvlText w:val="o"/>
-      <w:lvlJc w:val="left"/>
-      <w:pPr>
-        <w:ind w:left="3600" w:hanging="360"/>
-      </w:pPr>
-      <w:rPr>
-        <w:rFonts w:ascii="Courier New" w:hAnsi="Courier New" w:cs="Courier New" w:hint="default"/>
-      </w:rPr>
-    </w:lvl>
-    <w:lvl w:ilvl="5">
-      <w:numFmt w:val="bullet"/>
-      <w:lvlText w:val=""/>
-      <w:lvlJc w:val="left"/>
-      <w:pPr>
-        <w:ind w:left="4320" w:hanging="360"/>
-      </w:pPr>
-      <w:rPr>
-        <w:rFonts w:ascii="Wingdings" w:hAnsi="Wingdings" w:cs="Wingdings" w:hint="default"/>
-      </w:rPr>
-    </w:lvl>
-    <w:lvl w:ilvl="6">
-      <w:numFmt w:val="bullet"/>
-      <w:lvlText w:val=""/>
-      <w:lvlJc w:val="left"/>
-      <w:pPr>
-        <w:ind w:left="5040" w:hanging="360"/>
-      </w:pPr>
-      <w:rPr>
-        <w:rFonts w:ascii="Symbol" w:hAnsi="Symbol" w:cs="Symbol" w:hint="default"/>
-      </w:rPr>
-    </w:lvl>
-    <w:lvl w:ilvl="7">
-      <w:numFmt w:val="bullet"/>
-      <w:lvlText w:val="o"/>
-      <w:lvlJc w:val="left"/>
-      <w:pPr>
-        <w:ind w:left="5760" w:hanging="360"/>
-      </w:pPr>
-      <w:rPr>
-        <w:rFonts w:ascii="Courier New" w:hAnsi="Courier New" w:cs="Courier New" w:hint="default"/>
-      </w:rPr>
-    </w:lvl>
-    <w:lvl w:ilvl="8">
-      <w:numFmt w:val="bullet"/>
-      <w:lvlText w:val=""/>
-      <w:lvlJc w:val="left"/>
-      <w:pPr>
-        <w:ind w:left="6480" w:hanging="360"/>
-      </w:pPr>
-      <w:rPr>
-        <w:rFonts w:ascii="Wingdings" w:hAnsi="Wingdings" w:cs="Wingdings" w:hint="default"/>
-      </w:rPr>
-    </w:lvl>
-  </w:abstractNum>
   <w:num w:numId="1000">
     <w:abstractNumId w:val="990"/>
-  </w:num>
-  <w:num w:numId="1001">
-    <w:abstractNumId w:val="991"/>
-  </w:num>
-  <w:num w:numId="1002">
-    <w:abstractNumId w:val="991"/>
   </w:num>
 </w:numbering>
 </file>

</xml_diff>

<commit_message>
docs: proofread all three submission documents
Grammar and spelling pass over the technical report, README and demo
script: missing articles fixed, a broken verb chain repaired, a
subject-verb disagreement corrected, a doubled colon and awkward phrasing
reworked, and 'premium math' converted to British 'maths'. Verified with
aspell (en_GB): no misspellings; all flagged words are technical terms or
proper nouns. The report still fits exactly 5 pages.
</commit_message>
<xml_diff>
--- a/docs/technical-report.docx
+++ b/docs/technical-report.docx
@@ -119,7 +119,7 @@
         <w:pStyle w:val="FirstParagraph"/>
       </w:pPr>
       <w:r>
-        <w:t xml:space="preserve">The approved scope proposed a blockchain-based weather-index insurance system in which rainfall is measured by multiple independent sources, policies are sold and settled by smart contract without a claims process, and farmers, field agents and administrators manage cover through a web application. The delivered system matches that scope. One planned element (SMS delivery) is implemented but optional in configuration, and fiat settlement is deferred because it requires a licensed payment provider.</w:t>
+        <w:t xml:space="preserve">The approved scope proposed a blockchain-based weather-index insurance system in which rainfall is measured by multiple independent sources, policies are sold and settled by smart contracts without a claims process, and farmers, field agents and administrators manage cover through a web application. The delivered system matches that scope. One planned element (SMS delivery) is implemented but optional in configuration, and fiat settlement is deferred because it requires a licensed payment provider.</w:t>
       </w:r>
     </w:p>
     <w:tbl>
@@ -241,7 +241,7 @@
               <w:t xml:space="preserve">WeatherIndexInsurance.sol</w:t>
             </w:r>
             <w:r>
-              <w:t xml:space="preserve">; 56 tests; Policy #0 bought and paid on Sepolia</w:t>
+              <w:t xml:space="preserve">; 56 tests; Policy #0 bought and paid out on Sepolia</w:t>
             </w:r>
           </w:p>
         </w:tc>
@@ -1008,7 +1008,7 @@
         <w:t xml:space="preserve"> </w:t>
       </w:r>
       <w:r>
-        <w:t xml:space="preserve">Policy purchase as agent and as farmer; the farmer dashboard and payouts ledger; the admin’s oracle evaluation view; the consensus simulator corrupting one source; the backtest.</w:t>
+        <w:t xml:space="preserve">Policy purchase by an agent and by a farmer; the farmer dashboard and payouts ledger; the admin’s oracle evaluation view; the consensus simulator corrupting one source; the backtest.</w:t>
       </w:r>
     </w:p>
     <w:p>
@@ -1044,7 +1044,7 @@
         <w:t xml:space="preserve"> </w:t>
       </w:r>
       <w:r>
-        <w:t xml:space="preserve">Wrong premium, closed window, insufficient pool capacity, wrong wallet network, invalid codes and role escalation are each shown refusing safely with a plain-language error.</w:t>
+        <w:t xml:space="preserve">The video shows a wrong premium, a closed window, insufficient pool capacity, a wrong wallet network, invalid codes and role escalation each refused safely, with a plain-language error.</w:t>
       </w:r>
     </w:p>
     <w:p>
@@ -1431,7 +1431,7 @@
         <w:t xml:space="preserve"> </w:t>
       </w:r>
       <w:r>
-        <w:t xml:space="preserve">Rainfall is stored as integer hundredths of millimetres and dekads as period ids (YYYYMMD). A window sums exactly its period set, so settlement is exact and auditable.</w:t>
+        <w:t xml:space="preserve">Rainfall is stored as integer hundredths of millimetres and dekads as period ids (YYYYMMD). A window sums exactly the periods it contains, so settlement is exact and auditable.</w:t>
       </w:r>
     </w:p>
     <w:p>
@@ -1449,7 +1449,7 @@
         <w:t xml:space="preserve"> </w:t>
       </w:r>
       <w:r>
-        <w:t xml:space="preserve">Stores serialise writes through a promise chain and write via temporary file and rename, making each update atomic. The relayer fetches sources with bounded concurrency (</w:t>
+        <w:t xml:space="preserve">Stores serialise writes through a promise chain and write to a temporary file before renaming it, which makes each update atomic. The relayer fetches sources with bounded concurrency (</w:t>
       </w:r>
       <w:r>
         <w:rPr>
@@ -1476,7 +1476,7 @@
         <w:t xml:space="preserve"> </w:t>
       </w:r>
       <w:r>
-        <w:t xml:space="preserve">scrypt password hashing, constant-time API-key comparison, single-use attempt-capped verification codes, and per-hour rate limits, each with regression tests.</w:t>
+        <w:t xml:space="preserve">The system uses scrypt password hashing, constant-time API-key comparison, single-use attempt-capped verification codes and per-hour rate limits, each with regression tests.</w:t>
       </w:r>
     </w:p>
     <w:p>
@@ -1504,7 +1504,7 @@
         <w:t xml:space="preserve"> </w:t>
       </w:r>
       <w:r>
-        <w:t xml:space="preserve">Selected because the contract invariants are the product’s fairness guarantees. The suite runs 56 Solidity tests (including a fuzz test over pool reserves), 203 backend unit tests and 20 frontend tests. It covers premium maths (10% of the payout, rounded up), reverting sales the pool cannot cover, payouts that happen once and only below threshold, and every audit finding pinned by a named regression test. Result: 292 tests green, and the suite caught real defects (a GET-versus-POST resend route, a password stored in clear text at seed time, tests writing into production data), each fixed and pinned.</w:t>
+        <w:t xml:space="preserve">Selected because the contract invariants are the product’s fairness guarantees. The suite runs 56 Solidity tests (including a fuzz test over pool reserves), 203 backend unit tests and 20 frontend tests. It covers premium maths (10% of the payout, rounded up), reverting sales the pool cannot cover, payouts that happen once and only below the threshold, and every audit finding pinned by a named regression test. Result: 292 tests green, and the suite caught real defects (a GET-versus-POST resend route, a password stored in clear text at seed time, tests writing into production data), each fixed and pinned.</w:t>
       </w:r>
     </w:p>
     <w:p>
@@ -1522,7 +1522,7 @@
         <w:t xml:space="preserve"> </w:t>
       </w:r>
       <w:r>
-        <w:t xml:space="preserve">Selected because the guarantees span HTTP, storage, wallet and chain. Mocha drives the contracts through ethers.js as the application does (13 scenarios); auth routes run against a real Express server with cookie jars; the deployed system was exercised live, and the first policy was bought and paid out autonomously. Result: flows verified in production. Failures traced to wallet infrastructure (stale RPC state, wrong network) and led to hardening: gas pre-estimated on the app’s own RPC, account switches followed, wrong-chain signing refused.</w:t>
+        <w:t xml:space="preserve">Selected because the guarantees span HTTP, storage, wallet and chain. Mocha drives the contracts through ethers.js as the application does (13 scenarios); auth routes run against a real Express server with cookie jars; the deployed system was exercised live, and the first policy was bought and paid out autonomously. Result: flows verified in production. Failures traced to wallet infrastructure (stale RPC state, wrong network) led to hardening: gas pre-estimated on the app’s own RPC, account switches followed, wrong-chain signing refused.</w:t>
       </w:r>
     </w:p>
     <w:p>
@@ -1840,7 +1840,7 @@
         <w:pStyle w:val="FirstParagraph"/>
       </w:pPr>
       <w:r>
-        <w:t xml:space="preserve">The farmer side targets low-power hardware: the layout renders at 390 px, naira figures degrade gracefully when FX providers are down, and chain reads retry through RPC hiccups.</w:t>
+        <w:t xml:space="preserve">The farmer side targets low-power hardware: the layout renders at 390 px, naira figures degrade gracefully when FX providers are down, and chain reads recover from RPC hiccups through retries.</w:t>
       </w:r>
     </w:p>
     <w:p>

</xml_diff>